<commit_message>
Esquema de conexiones, prueba de banco y lectura de sensores I²C
- circuito/: esquema completo (SVG/PNG generado por script), tabla de
  conexiones pin por pin, configuración DIP de los TB6600,
  identificación de bobinas y procedimiento de prueba en 11 pasos.
- prototipo/telescopio/sensores.py: lectura del AS5600 (ángulo, estado
  del imán) y del acelerómetro del GY-91 (inclinación del trípode).
- prototipo/telescopio/prueba_banco.py: pruebas por componente (motor,
  fines de carrera, GPS, escaneo I²C, encoder, nivel).
- Artículo: la Figura 3 pasa a ser el esquema de conexiones.
- 37 pruebas automáticas.

Co-Authored-By: Claude Opus 5.5 <noreply@anthropic.com>
Claude-Session: https://claude.ai/code/session_01XDzR9MrnQVqkmQGo8xZFE3
</commit_message>
<xml_diff>
--- a/articulo/articulo_v2.docx
+++ b/articulo/articulo_v2.docx
@@ -673,13 +673,7 @@
         <w:jc w:val="both"/>
       </w:pPr>
       <w:r>
-        <w:t xml:space="preserve">El controlador central fue una Raspberry Pi 4 (2 GB), elegida porque ejecuta en un mismo dispositivo el cálculo de efemérides, el servidor web y el modelo de aprendizaje automático. Esta elección sustituyó al microcontrolador ESP32 considerado en la planificación inicial, que no permitía ejecutar estas tareas de forma local. Dos controladores TB6600, configurados en 16 micropasos y 1,5 A, accionan los motores paso a paso NEMA 23 a partir de las señales de paso, dirección y habilitación generadas por los pines GPIO. Un módulo GPS u-blox NEO-6M proporciona la ubicación y la hora UTC; un módulo GY-91 (acelerómetro y barómetro) mide la inclinación del trípode y la presión atmosférica; y un codificador magnético AS5600 mide el ángulo real del eje de altitud. Dos interruptores de fin de carrera detienen el eje de altitud en los extremos de su recorrido. Para la operación en campo, el sistema se alimentó con una batería LiFePO4 de 12,8 V y 12 Ah, con fusible, interruptor general y pulsador de paro de emergencia (Figura 3). </w:t>
-      </w:r>
-      <w:r>
-        <w:rPr>
-          <w:highlight w:val="yellow"/>
-        </w:rPr>
-        <w:t xml:space="preserve">[[Agregar la figura del esquema de conexiones completo cuando esté terminado.]]</w:t>
+        <w:t xml:space="preserve">El controlador central fue una Raspberry Pi 4 (2 GB), elegida porque ejecuta en un mismo dispositivo el cálculo de efemérides, el servidor web y el modelo de aprendizaje automático. Esta elección sustituyó al microcontrolador ESP32 considerado en la planificación inicial, que no permitía ejecutar estas tareas de forma local. Dos controladores TB6600, configurados en 16 micropasos y 1,5 A, accionan los motores paso a paso NEMA 23 a partir de las señales de paso, dirección y habilitación generadas por los pines GPIO. Un módulo GPS u-blox NEO-6M proporciona la ubicación y la hora UTC; un módulo GY-91 (acelerómetro y barómetro) mide la inclinación del trípode y la presión atmosférica; y un codificador magnético AS5600 mide el ángulo real del eje de altitud. Dos interruptores de fin de carrera detienen el eje de altitud en los extremos de su recorrido. Para la operación en campo, el sistema se alimentó con una batería LiFePO4 de 12,8 V y 12 Ah, con fusible, interruptor general y un pulsador de paro de emergencia que corta solo la alimentación de los motores. La Figura 3 muestra el esquema de conexiones completo.</w:t>
       </w:r>
     </w:p>
     <w:p>
@@ -699,7 +693,7 @@
           <w:i/>
           <w:iCs/>
         </w:rPr>
-        <w:t xml:space="preserve">Diagrama de alimentación del sistema</w:t>
+        <w:t xml:space="preserve">Esquema de conexiones del sistema</w:t>
       </w:r>
     </w:p>
     <w:p>
@@ -710,7 +704,7 @@
       <w:r>
         <w:drawing>
           <wp:inline distT="0" distB="0" distL="0" distR="0">
-            <wp:extent cx="5400675" cy="2514600"/>
+            <wp:extent cx="5762625" cy="4448175"/>
             <wp:effectExtent t="0" r="0" b="0" l="0"/>
             <wp:docPr id="1" name="" descr="" title=""/>
             <wp:cNvGraphicFramePr>
@@ -735,7 +729,7 @@
                   <pic:spPr bwMode="auto">
                     <a:xfrm>
                       <a:off x="0" y="0"/>
-                      <a:ext cx="5400675" cy="2514600"/>
+                      <a:ext cx="5762625" cy="4448175"/>
                     </a:xfrm>
                     <a:prstGeom prst="rect">
                       <a:avLst/>
@@ -767,7 +761,7 @@
           <w:sz w:val="20"/>
           <w:szCs w:val="20"/>
         </w:rPr>
-        <w:t xml:space="preserve">Elaboración propia.</w:t>
+        <w:t xml:space="preserve">Elaboración propia. Los números corresponden a los pines físicos de la Raspberry Pi 4.</w:t>
       </w:r>
     </w:p>
     <w:p>

</xml_diff>

<commit_message>
Artículo: actualizar el número de pruebas automáticas (37)
Co-Authored-By: Claude Opus 5.5 <noreply@anthropic.com>
Claude-Session: https://claude.ai/code/session_01XDzR9MrnQVqkmQGo8xZFE3
</commit_message>
<xml_diff>
--- a/articulo/articulo_v2.docx
+++ b/articulo/articulo_v2.docx
@@ -2057,16 +2057,7 @@
         <w:jc w:val="both"/>
       </w:pPr>
       <w:r>
-        <w:t xml:space="preserve">El software se desarrolló en Python y se ejecuta en la Raspberry Pi. Las posiciones aparentes de los planetas y de la Luna se calcularon con la biblioteca Skyfield (Rhodes, 2019) a partir de las efemérides DE421 del Jet Propulsion Laboratory, para la ubicación y la hora entregadas por el GPS y con corrección por refracción atmosférica. El movimiento de los motores sigue un perfil de velocidad trapezoidal, con aceleración y frenado progresivos para evitar la pérdida de pasos (Fonseca-Campos et al., 2023), y ambos ejes se mueven de forma simultánea. Un servidor web desarrollado con FastAPI expone una interfaz accesible desde cualquier navegador de la red local (Figura 4): la Raspberry Pi crea su propia red inalámbrica, por lo que no se requiere conexión a Internet. Desde la interfaz el usuario elige un planeta visible, ordena el apuntado, centra el objeto con botones de ajuste fino y confirma el centrado. El software se verificó con </w:t>
-      </w:r>
-      <w:r>
-        <w:rPr>
-          <w:highlight w:val="yellow"/>
-        </w:rPr>
-        <w:t xml:space="preserve">[[29]]</w:t>
-      </w:r>
-      <w:r>
-        <w:t xml:space="preserve"> pruebas automáticas y en un modo de simulación sin hardware.</w:t>
+        <w:t xml:space="preserve">El software se desarrolló en Python y se ejecuta en la Raspberry Pi. Las posiciones aparentes de los planetas y de la Luna se calcularon con la biblioteca Skyfield (Rhodes, 2019) a partir de las efemérides DE421 del Jet Propulsion Laboratory, para la ubicación y la hora entregadas por el GPS y con corrección por refracción atmosférica. El movimiento de los motores sigue un perfil de velocidad trapezoidal, con aceleración y frenado progresivos para evitar la pérdida de pasos (Fonseca-Campos et al., 2023), y ambos ejes se mueven de forma simultánea. Un servidor web desarrollado con FastAPI expone una interfaz accesible desde cualquier navegador de la red local (Figura 4): la Raspberry Pi crea su propia red inalámbrica, por lo que no se requiere conexión a Internet. Desde la interfaz el usuario elige un planeta visible, ordena el apuntado, centra el objeto con botones de ajuste fino y confirma el centrado. El software se verificó con 37 pruebas automáticas y en un modo de simulación sin hardware.</w:t>
       </w:r>
     </w:p>
     <w:p>

</xml_diff>

<commit_message>
Montura: caja de control y panel de energía para la electrónica
- montura.scad: nuevas piezas caja_control, tapa_caja, panel_energia y
  tapa_panel; la caja va atornillada a la base fija (no gira) y aloja la
  Raspberry Pi 4, los 2 TB6600, el step-down, el GY-91 y el GPS. Se
  muestra en el ensamble (caja_vista).
- STL nuevos y base_fija regenerada; imágenes del ensamble y de la caja.
- LEEME de montura (§6 ¿Dónde va la electrónica?), circuito y lista de
  compras actualizados (PETG 2 kg, prensaestopas PG7).
- Artículo v2: descripción de la caja y masa de PETG actualizadas.

Co-Authored-By: Claude Opus 5.5 <noreply@anthropic.com>
Claude-Session: https://claude.ai/code/session_01XDzR9MrnQVqkmQGo8xZFE3
</commit_message>
<xml_diff>
--- a/articulo/articulo_v2.docx
+++ b/articulo/articulo_v2.docx
@@ -515,7 +515,7 @@
         <w:jc w:val="both"/>
       </w:pPr>
       <w:r>
-        <w:t xml:space="preserve">Se diseñó una montura altacimutal de un solo brazo, modelada de forma paramétrica en OpenSCAD para que sus medidas puedan adaptarse a los componentes disponibles (Figura 2). La cabeza de la montura se fabricó con diez piezas impresas en 3D en PETG, que se monta sobre un trípode comercial de aluminio con rosca de 5/8″; se evitó imprimir el trípode porque su flexión degradaría la precisión. El eje de azimut gira sobre un rodamiento plano de 102 mm y es accionado por una corona dentada GT2 de 280 dientes impresa en el borde del plato giratorio, con una polea de 20 dientes en el motor (reducción de 14:1). El eje de altitud es una varilla de acero de 8 mm apoyada en dos rodamientos 608ZZ y accionada por una polea impresa de 100 dientes (reducción de 5:1). El brazo es un perfil de aluminio 2040, más rígido que una pieza impresa.</w:t>
+        <w:t xml:space="preserve">Se diseñó una montura altacimutal de un solo brazo, modelada de forma paramétrica en OpenSCAD para que sus medidas puedan adaptarse a los componentes disponibles (Figura 2). La cabeza de la montura se fabricó con nueve piezas impresas en 3D en PETG y se monta sobre un trípode comercial de aluminio con rosca de 5/8″; se evitó imprimir el trípode porque su flexión degradaría la precisión. La electrónica se alojó en una caja impresa atornillada a la base fija, que no gira con la montura, y los elementos de protección eléctrica en un panel impreso junto a la batería. El eje de azimut gira sobre un rodamiento plano de 102 mm y es accionado por una corona dentada GT2 de 280 dientes impresa en el borde del plato giratorio, con una polea de 20 dientes en el motor (reducción de 14:1). El eje de altitud es una varilla de acero de 8 mm apoyada en dos rodamientos 608ZZ y accionada por una polea impresa de 100 dientes (reducción de 5:1). El brazo es un perfil de aluminio 2040, más rígido que una pieza impresa.</w:t>
       </w:r>
     </w:p>
     <w:p>
@@ -1739,7 +1739,7 @@
                 <w:sz w:val="20"/>
                 <w:szCs w:val="20"/>
               </w:rPr>
-              <w:t xml:space="preserve">PETG, ≈ 690 g</w:t>
+              <w:t xml:space="preserve">PETG, ≈ 1 020 g (montura, caja de control y panel)</w:t>
             </w:r>
           </w:p>
         </w:tc>
@@ -1765,7 +1765,7 @@
                 <w:sz w:val="20"/>
                 <w:szCs w:val="20"/>
               </w:rPr>
-              <w:t xml:space="preserve">10</w:t>
+              <w:t xml:space="preserve">13</w:t>
             </w:r>
           </w:p>
         </w:tc>

</xml_diff>

<commit_message>
Artículo v2: Figura 2 con la caja de control
Co-Authored-By: Claude Opus 5.5 <noreply@anthropic.com>
Claude-Session: https://claude.ai/code/session_01XDzR9MrnQVqkmQGo8xZFE3
</commit_message>
<xml_diff>
--- a/articulo/articulo_v2.docx
+++ b/articulo/articulo_v2.docx
@@ -582,7 +582,7 @@
           <w:i/>
           <w:iCs/>
         </w:rPr>
-        <w:t xml:space="preserve">Modelo 3D de la montura altacimutal con un telescopio de referencia</w:t>
+        <w:t xml:space="preserve">Modelo 3D de la montura altacimutal con un telescopio de referencia y la caja de control</w:t>
       </w:r>
     </w:p>
     <w:p>
@@ -593,7 +593,7 @@
       <w:r>
         <w:drawing>
           <wp:inline distT="0" distB="0" distL="0" distR="0">
-            <wp:extent cx="3238500" cy="4191000"/>
+            <wp:extent cx="3781425" cy="4086225"/>
             <wp:effectExtent t="0" r="0" b="0" l="0"/>
             <wp:docPr id="1" name="" descr="" title=""/>
             <wp:cNvGraphicFramePr>
@@ -618,7 +618,7 @@
                   <pic:spPr bwMode="auto">
                     <a:xfrm>
                       <a:off x="0" y="0"/>
-                      <a:ext cx="3238500" cy="4191000"/>
+                      <a:ext cx="3781425" cy="4086225"/>
                     </a:xfrm>
                     <a:prstGeom prst="rect">
                       <a:avLst/>
@@ -650,7 +650,7 @@
           <w:sz w:val="20"/>
           <w:szCs w:val="20"/>
         </w:rPr>
-        <w:t xml:space="preserve">Elaboración propia. Telescopio Maksutov-Cassegrain de 90 mm representado de forma simplificada.</w:t>
+        <w:t xml:space="preserve">Elaboración propia. Telescopio Maksutov-Cassegrain de 90 mm representado de forma simplificada; la tapa de la caja se muestra transparente y levantada.</w:t>
       </w:r>
     </w:p>
     <w:p>

</xml_diff>